<commit_message>
Word da proposta: recuo nos topicos, tabela dos termos sempre em folha propria, respiro nos itens e folga antes das especificacoes
Co-Authored-By: Claude Sonnet 5.5 <noreply@anthropic.com>
</commit_message>
<xml_diff>
--- a/templates/proposta-maquina.docx
+++ b/templates/proposta-maquina.docx
@@ -3525,150 +3525,12 @@
     </w:p>
     <w:p>
       <w:pPr>
+        <w:pageBreakBefore/>
         <w:spacing w:after="0"/>
-        <w:rPr>
-          <w:rFonts w:ascii="Arial" w:hAnsi="Arial" w:cs="Arial"/>
-          <w:b/>
-          <w:sz w:val="16"/>
-          <w:szCs w:val="20"/>
-        </w:rPr>
-      </w:pPr>
-    </w:p>
-    <w:p>
-      <w:pPr>
-        <w:spacing w:after="0"/>
-        <w:rPr>
-          <w:rFonts w:ascii="Arial" w:hAnsi="Arial" w:cs="Arial"/>
-          <w:b/>
-          <w:sz w:val="16"/>
-          <w:szCs w:val="20"/>
-        </w:rPr>
-      </w:pPr>
-    </w:p>
-    <w:p>
-      <w:pPr>
-        <w:spacing w:after="0"/>
-        <w:rPr>
-          <w:rFonts w:ascii="Arial" w:hAnsi="Arial" w:cs="Arial"/>
-          <w:b/>
-          <w:sz w:val="16"/>
-          <w:szCs w:val="20"/>
-        </w:rPr>
-      </w:pPr>
-    </w:p>
-    <w:p>
-      <w:pPr>
-        <w:spacing w:after="0"/>
-        <w:rPr>
-          <w:rFonts w:ascii="Arial" w:hAnsi="Arial" w:cs="Arial"/>
-          <w:b/>
-          <w:sz w:val="16"/>
-          <w:szCs w:val="20"/>
-        </w:rPr>
-      </w:pPr>
-    </w:p>
-    <w:p>
-      <w:pPr>
-        <w:spacing w:after="0"/>
-        <w:rPr>
-          <w:rFonts w:ascii="Arial" w:hAnsi="Arial" w:cs="Arial"/>
-          <w:b/>
-          <w:sz w:val="16"/>
-          <w:szCs w:val="20"/>
-        </w:rPr>
-      </w:pPr>
-    </w:p>
-    <w:p>
-      <w:pPr>
-        <w:spacing w:after="0"/>
-        <w:rPr>
-          <w:rFonts w:ascii="Arial" w:hAnsi="Arial" w:cs="Arial"/>
-          <w:b/>
-          <w:sz w:val="16"/>
-          <w:szCs w:val="20"/>
-        </w:rPr>
-      </w:pPr>
-    </w:p>
-    <w:p>
-      <w:pPr>
-        <w:spacing w:after="0"/>
-        <w:rPr>
-          <w:rFonts w:ascii="Arial" w:hAnsi="Arial" w:cs="Arial"/>
-          <w:b/>
-          <w:sz w:val="16"/>
-          <w:szCs w:val="20"/>
-        </w:rPr>
-      </w:pPr>
-    </w:p>
-    <w:p>
-      <w:pPr>
-        <w:spacing w:after="0"/>
-        <w:rPr>
-          <w:rFonts w:ascii="Arial" w:hAnsi="Arial" w:cs="Arial"/>
-          <w:b/>
-          <w:sz w:val="16"/>
-          <w:szCs w:val="20"/>
-        </w:rPr>
-      </w:pPr>
-    </w:p>
-    <w:p>
-      <w:pPr>
-        <w:spacing w:after="0"/>
-        <w:rPr>
-          <w:rFonts w:ascii="Arial" w:hAnsi="Arial" w:cs="Arial"/>
-          <w:b/>
-          <w:sz w:val="16"/>
-          <w:szCs w:val="20"/>
-        </w:rPr>
-      </w:pPr>
-    </w:p>
-    <w:p>
-      <w:pPr>
-        <w:spacing w:after="0"/>
-        <w:rPr>
-          <w:rFonts w:ascii="Arial" w:hAnsi="Arial" w:cs="Arial"/>
-          <w:b/>
-          <w:sz w:val="16"/>
-          <w:szCs w:val="20"/>
-        </w:rPr>
-      </w:pPr>
-    </w:p>
-    <w:p>
-      <w:pPr>
-        <w:spacing w:after="0"/>
-        <w:rPr>
-          <w:rFonts w:ascii="Arial" w:hAnsi="Arial" w:cs="Arial"/>
-          <w:b/>
-          <w:sz w:val="16"/>
-          <w:szCs w:val="20"/>
-        </w:rPr>
-      </w:pPr>
-    </w:p>
-    <w:p>
-      <w:pPr>
-        <w:spacing w:after="0"/>
-        <w:rPr>
-          <w:rFonts w:ascii="Arial" w:hAnsi="Arial" w:cs="Arial"/>
-          <w:b/>
-          <w:sz w:val="16"/>
-          <w:szCs w:val="20"/>
-        </w:rPr>
-      </w:pPr>
-    </w:p>
-    <w:p>
-      <w:pPr>
-        <w:spacing w:after="0"/>
-        <w:rPr>
-          <w:rFonts w:ascii="Arial" w:hAnsi="Arial" w:cs="Arial"/>
-          <w:b/>
-          <w:sz w:val="16"/>
-          <w:szCs w:val="20"/>
-        </w:rPr>
       </w:pPr>
     </w:p>
     <w:tbl>
       <w:tblPr>
-        <w:tblpPr w:leftFromText="141" w:rightFromText="141" w:vertAnchor="page" w:horzAnchor="margin" w:tblpY="1592"/>
         <w:tblW w:w="0" w:type="auto"/>
         <w:tblBorders>
           <w:top w:val="single" w:sz="4" w:space="0" w:color="auto"/>

</xml_diff>